<commit_message>
feat: harden site operations and induction workflows
</commit_message>
<xml_diff>
--- a/templates/UHSF16.01_Template.docx
+++ b/templates/UHSF16.01_Template.docx
@@ -1,6 +1,6 @@
 
 <file path=word/document.xml><?xml version="1.0" encoding="utf-8"?>
-<w:document xmlns:wpc="http://schemas.microsoft.com/office/word/2010/wordprocessingCanvas" xmlns:cx="http://schemas.microsoft.com/office/drawing/2014/chartex" xmlns:cx1="http://schemas.microsoft.com/office/drawing/2015/9/8/chartex" xmlns:cx2="http://schemas.microsoft.com/office/drawing/2015/10/21/chartex" xmlns:cx3="http://schemas.microsoft.com/office/drawing/2016/5/9/chartex" xmlns:cx4="http://schemas.microsoft.com/office/drawing/2016/5/10/chartex" xmlns:cx5="http://schemas.microsoft.com/office/drawing/2016/5/11/chartex" xmlns:cx6="http://schemas.microsoft.com/office/drawing/2016/5/12/chartex" xmlns:cx7="http://schemas.microsoft.com/office/drawing/2016/5/13/chartex" xmlns:cx8="http://schemas.microsoft.com/office/drawing/2016/5/14/chartex" xmlns:mc="http://schemas.openxmlformats.org/markup-compatibility/2006" xmlns:aink="http://schemas.microsoft.com/office/drawing/2016/ink" xmlns:am3d="http://schemas.microsoft.com/office/drawing/2017/model3d" xmlns:o="urn:schemas-microsoft-com:office:office" xmlns:oel="http://schemas.microsoft.com/office/2019/extlst" xmlns:r="http://schemas.openxmlformats.org/officeDocument/2006/relationships" xmlns:m="http://schemas.openxmlformats.org/officeDocument/2006/math" xmlns:v="urn:schemas-microsoft-com:vml" xmlns:wp14="http://schemas.microsoft.com/office/word/2010/wordprocessingDrawing" xmlns:wp="http://schemas.openxmlformats.org/drawingml/2006/wordprocessingDrawing" xmlns:w10="urn:schemas-microsoft-com:office:word" xmlns:w="http://schemas.openxmlformats.org/wordprocessingml/2006/main" xmlns:w14="http://schemas.microsoft.com/office/word/2010/wordml" xmlns:w15="http://schemas.microsoft.com/office/word/2012/wordml" xmlns:w16cex="http://schemas.microsoft.com/office/word/2018/wordml/cex" xmlns:w16cid="http://schemas.microsoft.com/office/word/2016/wordml/cid" xmlns:w16="http://schemas.microsoft.com/office/word/2018/wordml" xmlns:w16sdtdh="http://schemas.microsoft.com/office/word/2020/wordml/sdtdatahash" xmlns:w16se="http://schemas.microsoft.com/office/word/2015/wordml/symex" xmlns:wpg="http://schemas.microsoft.com/office/word/2010/wordprocessingGroup" xmlns:wpi="http://schemas.microsoft.com/office/word/2010/wordprocessingInk" xmlns:wne="http://schemas.microsoft.com/office/word/2006/wordml" xmlns:wps="http://schemas.microsoft.com/office/word/2010/wordprocessingShape" xmlns:a="http://schemas.openxmlformats.org/drawingml/2006/main" xmlns:pic="http://schemas.openxmlformats.org/drawingml/2006/picture" xmlns:a14="http://schemas.microsoft.com/office/drawing/2010/main" mc:Ignorable="w14 w15 w16se w16cid w16 w16cex w16sdtdh wp14">
+<w:document xmlns:wpc="http://schemas.microsoft.com/office/word/2010/wordprocessingCanvas" xmlns:cx="http://schemas.microsoft.com/office/drawing/2014/chartex" xmlns:cx1="http://schemas.microsoft.com/office/drawing/2015/9/8/chartex" xmlns:cx2="http://schemas.microsoft.com/office/drawing/2015/10/21/chartex" xmlns:cx3="http://schemas.microsoft.com/office/drawing/2016/5/9/chartex" xmlns:cx4="http://schemas.microsoft.com/office/drawing/2016/5/10/chartex" xmlns:cx5="http://schemas.microsoft.com/office/drawing/2016/5/11/chartex" xmlns:cx6="http://schemas.microsoft.com/office/drawing/2016/5/12/chartex" xmlns:cx7="http://schemas.microsoft.com/office/drawing/2016/5/13/chartex" xmlns:cx8="http://schemas.microsoft.com/office/drawing/2016/5/14/chartex" xmlns:mc="http://schemas.openxmlformats.org/markup-compatibility/2006" xmlns:aink="http://schemas.microsoft.com/office/drawing/2016/ink" xmlns:am3d="http://schemas.microsoft.com/office/drawing/2017/model3d" xmlns:o="urn:schemas-microsoft-com:office:office" xmlns:oel="http://schemas.microsoft.com/office/2019/extlst" xmlns:r="http://schemas.openxmlformats.org/officeDocument/2006/relationships" xmlns:m="http://schemas.openxmlformats.org/officeDocument/2006/math" xmlns:v="urn:schemas-microsoft-com:vml" xmlns:wp14="http://schemas.microsoft.com/office/word/2010/wordprocessingDrawing" xmlns:wp="http://schemas.openxmlformats.org/drawingml/2006/wordprocessingDrawing" xmlns:w10="urn:schemas-microsoft-com:office:word" xmlns:w="http://schemas.openxmlformats.org/wordprocessingml/2006/main" xmlns:w14="http://schemas.microsoft.com/office/word/2010/wordml" xmlns:w15="http://schemas.microsoft.com/office/word/2012/wordml" xmlns:w16cex="http://schemas.microsoft.com/office/word/2018/wordml/cex" xmlns:w16cid="http://schemas.microsoft.com/office/word/2016/wordml/cid" xmlns:w16="http://schemas.microsoft.com/office/word/2018/wordml" xmlns:w16du="http://schemas.microsoft.com/office/word/2023/wordml/word16du" xmlns:w16sdtdh="http://schemas.microsoft.com/office/word/2020/wordml/sdtdatahash" xmlns:w16sdtfl="http://schemas.microsoft.com/office/word/2024/wordml/sdtformatlock" xmlns:w16se="http://schemas.microsoft.com/office/word/2015/wordml/symex" xmlns:wpg="http://schemas.microsoft.com/office/word/2010/wordprocessingGroup" xmlns:wpi="http://schemas.microsoft.com/office/word/2010/wordprocessingInk" xmlns:wne="http://schemas.microsoft.com/office/word/2006/wordml" xmlns:wps="http://schemas.microsoft.com/office/word/2010/wordprocessingShape" mc:Ignorable="w14 w15 w16se w16cid w16 w16cex w16sdtdh w16sdtfl w16du wp14">
   <w:body>
     <w:tbl>
       <w:tblPr>
@@ -8,12 +8,12 @@
         <w:tblW w:w="10859" w:type="dxa"/>
         <w:tblInd w:w="-743" w:type="dxa"/>
         <w:tblBorders>
-          <w:top w:val="single" w:color="D9D9D9" w:themeColor="background1" w:themeShade="D9" w:sz="4" w:space="0"/>
-          <w:left w:val="single" w:color="D9D9D9" w:themeColor="background1" w:themeShade="D9" w:sz="4" w:space="0"/>
-          <w:bottom w:val="single" w:color="D9D9D9" w:themeColor="background1" w:themeShade="D9" w:sz="4" w:space="0"/>
-          <w:right w:val="single" w:color="D9D9D9" w:themeColor="background1" w:themeShade="D9" w:sz="4" w:space="0"/>
-          <w:insideH w:val="single" w:color="D9D9D9" w:themeColor="background1" w:themeShade="D9" w:sz="4" w:space="0"/>
-          <w:insideV w:val="single" w:color="D9D9D9" w:themeColor="background1" w:themeShade="D9" w:sz="4" w:space="0"/>
+          <w:top w:val="single" w:sz="4" w:space="0" w:color="D9D9D9" w:themeColor="background1" w:themeShade="D9"/>
+          <w:left w:val="single" w:sz="4" w:space="0" w:color="D9D9D9" w:themeColor="background1" w:themeShade="D9"/>
+          <w:bottom w:val="single" w:sz="4" w:space="0" w:color="D9D9D9" w:themeColor="background1" w:themeShade="D9"/>
+          <w:right w:val="single" w:sz="4" w:space="0" w:color="D9D9D9" w:themeColor="background1" w:themeShade="D9"/>
+          <w:insideH w:val="single" w:sz="4" w:space="0" w:color="D9D9D9" w:themeColor="background1" w:themeShade="D9"/>
+          <w:insideV w:val="single" w:sz="4" w:space="0" w:color="D9D9D9" w:themeColor="background1" w:themeShade="D9"/>
         </w:tblBorders>
         <w:tblLook w:val="04A0" w:firstRow="1" w:lastRow="0" w:firstColumn="1" w:lastColumn="0" w:noHBand="0" w:noVBand="1"/>
       </w:tblPr>
@@ -773,7 +773,7 @@
             <w:tcW w:w="10916" w:type="dxa"/>
             <w:gridSpan w:val="4"/>
             <w:tcBorders>
-              <w:bottom w:val="single" w:color="auto" w:sz="4" w:space="0"/>
+              <w:bottom w:val="single" w:sz="4" w:space="0" w:color="auto"/>
             </w:tcBorders>
             <w:shd w:val="pct20" w:color="auto" w:fill="auto"/>
             <w:vAlign w:val="center"/>
@@ -864,7 +864,6 @@
           <w:tcPr>
             <w:tcW w:w="10916" w:type="dxa"/>
             <w:gridSpan w:val="4"/>
-            <w:shd w:val="clear" w:color="auto" w:fill="auto"/>
             <w:vAlign w:val="center"/>
           </w:tcPr>
           <w:p>
@@ -960,10 +959,8 @@
           <w:tcPr>
             <w:tcW w:w="1489" w:type="dxa"/>
             <w:tcBorders>
-              <w:bottom w:val="single" w:color="auto" w:sz="4" w:space="0"/>
+              <w:bottom w:val="single" w:sz="4" w:space="0" w:color="auto"/>
             </w:tcBorders>
-            <w:shd w:val="clear" w:color="auto" w:fill="auto"/>
-            <w:tcMar/>
             <w:vAlign w:val="center"/>
           </w:tcPr>
           <w:p>
@@ -1009,15 +1006,23 @@
           <w:tcPr>
             <w:tcW w:w="1489" w:type="dxa"/>
             <w:tcBorders>
-              <w:bottom w:val="single" w:color="auto" w:sz="4"/>
+              <w:bottom w:val="single" w:sz="4" w:space="0" w:color="auto"/>
             </w:tcBorders>
-            <w:shd w:val="clear" w:color="auto" w:fill="auto"/>
-            <w:tcMar/>
-            <w:vAlign w:val="center"/>
-          </w:tcPr>
-          <w:p>
-            <w:r>
-              <w:t>{{ cscs }}</w:t>
+            <w:vAlign w:val="center"/>
+          </w:tcPr>
+          <w:p>
+            <w:r>
+              <w:t>{{ cscs</w:t>
+            </w:r>
+            <w:r>
+              <w:rPr>
+                <w:rFonts w:cs="Arial"/>
+                <w:color w:val="BD4043"/>
+              </w:rPr>
+              <w:t>_no</w:t>
+            </w:r>
+            <w:r>
+              <w:t xml:space="preserve"> }}</w:t>
             </w:r>
           </w:p>
         </w:tc>
@@ -1025,73 +1030,53 @@
           <w:tcPr>
             <w:tcW w:w="850" w:type="dxa"/>
             <w:tcBorders>
-              <w:bottom w:val="single" w:color="auto" w:sz="4" w:space="0"/>
+              <w:bottom w:val="single" w:sz="4" w:space="0" w:color="auto"/>
             </w:tcBorders>
-            <w:shd w:val="clear" w:color="auto" w:fill="auto"/>
-            <w:tcMar/>
-            <w:vAlign w:val="center"/>
-          </w:tcPr>
-          <w:p>
-            <w:pPr>
-              <w:pStyle w:val="Normal"/>
-              <w:ind w:right="-165"/>
-              <w:jc w:val="left"/>
-              <w:rPr>
-                <w:rFonts w:ascii="Verdana" w:hAnsi="Verdana" w:eastAsia="Verdana" w:cs="Verdana"/>
-                <w:noProof w:val="0"/>
-                <w:sz w:val="14"/>
-                <w:szCs w:val="14"/>
-                <w:lang w:val="en-GB"/>
-              </w:rPr>
-            </w:pPr>
-            <w:r>
-              <w:rPr>
-                <w:rFonts w:ascii="Verdana" w:hAnsi="Verdana" w:eastAsia="Verdana" w:cs="Verdana"/>
-                <w:b w:val="0"/>
-                <w:bCs w:val="0"/>
-                <w:i w:val="0"/>
-                <w:iCs w:val="0"/>
-                <w:caps w:val="0"/>
-                <w:smallCaps w:val="0"/>
-                <w:noProof w:val="0"/>
-                <w:color w:val="000000" w:themeColor="text1" w:themeTint="FF" w:themeShade="FF"/>
+            <w:vAlign w:val="center"/>
+          </w:tcPr>
+          <w:p>
+            <w:pPr>
+              <w:ind w:right="-165"/>
+              <w:rPr>
+                <w:rFonts w:ascii="Verdana" w:eastAsia="Verdana" w:hAnsi="Verdana" w:cs="Verdana"/>
+                <w:sz w:val="14"/>
+                <w:szCs w:val="14"/>
+              </w:rPr>
+            </w:pPr>
+            <w:r>
+              <w:rPr>
+                <w:rFonts w:ascii="Verdana" w:eastAsia="Verdana" w:hAnsi="Verdana" w:cs="Verdana"/>
+                <w:color w:val="000000" w:themeColor="text1"/>
                 <w:sz w:val="13"/>
                 <w:szCs w:val="13"/>
-                <w:lang w:val="en-GB"/>
               </w:rPr>
               <w:t xml:space="preserve"> </w:t>
             </w:r>
             <w:r>
               <w:rPr>
-                <w:rFonts w:ascii="Verdana" w:hAnsi="Verdana" w:eastAsia="Verdana" w:cs="Verdana"/>
-                <w:noProof w:val="0"/>
-                <w:sz w:val="14"/>
-                <w:szCs w:val="14"/>
-                <w:lang w:val="en-GB"/>
+                <w:rFonts w:ascii="Verdana" w:eastAsia="Verdana" w:hAnsi="Verdana" w:cs="Verdana"/>
+                <w:sz w:val="14"/>
+                <w:szCs w:val="14"/>
               </w:rPr>
               <w:t xml:space="preserve"> </w:t>
             </w:r>
             <w:r>
               <w:rPr>
-                <w:rFonts w:ascii="Verdana" w:hAnsi="Verdana" w:eastAsia="Verdana" w:cs="Verdana"/>
-                <w:b w:val="1"/>
-                <w:bCs w:val="1"/>
-                <w:noProof w:val="0"/>
-                <w:sz w:val="14"/>
-                <w:szCs w:val="14"/>
-                <w:lang w:val="en-GB"/>
+                <w:rFonts w:ascii="Verdana" w:eastAsia="Verdana" w:hAnsi="Verdana" w:cs="Verdana"/>
+                <w:b/>
+                <w:bCs/>
+                <w:sz w:val="14"/>
+                <w:szCs w:val="14"/>
               </w:rPr>
               <w:t>CSCS EXP</w:t>
             </w:r>
             <w:r>
               <w:rPr>
-                <w:rFonts w:ascii="Verdana" w:hAnsi="Verdana" w:eastAsia="Verdana" w:cs="Verdana"/>
-                <w:b w:val="1"/>
-                <w:bCs w:val="1"/>
-                <w:noProof w:val="0"/>
-                <w:sz w:val="14"/>
-                <w:szCs w:val="14"/>
-                <w:lang w:val="en-GB"/>
+                <w:rFonts w:ascii="Verdana" w:eastAsia="Verdana" w:hAnsi="Verdana" w:cs="Verdana"/>
+                <w:b/>
+                <w:bCs/>
+                <w:sz w:val="14"/>
+                <w:szCs w:val="14"/>
               </w:rPr>
               <w:t>IRY</w:t>
             </w:r>
@@ -1101,10 +1086,8 @@
           <w:tcPr>
             <w:tcW w:w="1276" w:type="dxa"/>
             <w:tcBorders>
-              <w:bottom w:val="single" w:color="auto" w:sz="4"/>
+              <w:bottom w:val="single" w:sz="4" w:space="0" w:color="auto"/>
             </w:tcBorders>
-            <w:shd w:val="clear" w:color="auto" w:fill="auto"/>
-            <w:tcMar/>
             <w:vAlign w:val="center"/>
           </w:tcPr>
           <w:p>
@@ -1118,10 +1101,8 @@
             <w:tcW w:w="5103" w:type="dxa"/>
             <w:gridSpan w:val="3"/>
             <w:tcBorders>
-              <w:bottom w:val="single" w:color="auto" w:sz="4" w:space="0"/>
+              <w:bottom w:val="single" w:sz="4" w:space="0" w:color="auto"/>
             </w:tcBorders>
-            <w:shd w:val="clear" w:color="auto" w:fill="auto"/>
-            <w:tcMar/>
             <w:vAlign w:val="center"/>
           </w:tcPr>
           <w:p>
@@ -1158,10 +1139,8 @@
           <w:tcPr>
             <w:tcW w:w="709" w:type="dxa"/>
             <w:tcBorders>
-              <w:bottom w:val="single" w:color="auto" w:sz="4" w:space="0"/>
+              <w:bottom w:val="single" w:sz="4" w:space="0" w:color="auto"/>
             </w:tcBorders>
-            <w:shd w:val="clear" w:color="auto" w:fill="auto"/>
-            <w:tcMar/>
             <w:vAlign w:val="center"/>
           </w:tcPr>
           <w:p>
@@ -1180,10 +1159,8 @@
             <w:tcW w:w="2978" w:type="dxa"/>
             <w:gridSpan w:val="2"/>
             <w:tcBorders>
-              <w:bottom w:val="single" w:color="auto" w:sz="4" w:space="0"/>
+              <w:bottom w:val="single" w:sz="4" w:space="0" w:color="auto"/>
             </w:tcBorders>
-            <w:shd w:val="clear" w:color="auto" w:fill="auto"/>
-            <w:tcMar/>
             <w:vAlign w:val="center"/>
           </w:tcPr>
           <w:p>
@@ -1220,10 +1197,8 @@
           <w:tcPr>
             <w:tcW w:w="850" w:type="dxa"/>
             <w:tcBorders>
-              <w:bottom w:val="single" w:color="auto" w:sz="4" w:space="0"/>
+              <w:bottom w:val="single" w:sz="4" w:space="0" w:color="auto"/>
             </w:tcBorders>
-            <w:shd w:val="clear" w:color="auto" w:fill="auto"/>
-            <w:tcMar/>
             <w:vAlign w:val="center"/>
           </w:tcPr>
           <w:p>
@@ -1236,10 +1211,8 @@
           <w:tcPr>
             <w:tcW w:w="1276" w:type="dxa"/>
             <w:tcBorders>
-              <w:bottom w:val="single" w:color="auto" w:sz="4" w:space="0"/>
+              <w:bottom w:val="single" w:sz="4" w:space="0" w:color="auto"/>
             </w:tcBorders>
-            <w:shd w:val="clear" w:color="auto" w:fill="auto"/>
-            <w:tcMar/>
             <w:vAlign w:val="center"/>
           </w:tcPr>
           <w:p>
@@ -1287,10 +1260,8 @@
           <w:tcPr>
             <w:tcW w:w="2410" w:type="dxa"/>
             <w:tcBorders>
-              <w:bottom w:val="single" w:color="auto" w:sz="4" w:space="0"/>
+              <w:bottom w:val="single" w:sz="4" w:space="0" w:color="auto"/>
             </w:tcBorders>
-            <w:shd w:val="clear" w:color="auto" w:fill="auto"/>
-            <w:tcMar/>
             <w:vAlign w:val="center"/>
           </w:tcPr>
           <w:p>
@@ -1303,10 +1274,8 @@
           <w:tcPr>
             <w:tcW w:w="1559" w:type="dxa"/>
             <w:tcBorders>
-              <w:bottom w:val="single" w:color="auto" w:sz="4" w:space="0"/>
+              <w:bottom w:val="single" w:sz="4" w:space="0" w:color="auto"/>
             </w:tcBorders>
-            <w:shd w:val="clear" w:color="auto" w:fill="auto"/>
-            <w:tcMar/>
             <w:vAlign w:val="center"/>
           </w:tcPr>
           <w:p>
@@ -1355,10 +1324,8 @@
             <w:tcW w:w="1843" w:type="dxa"/>
             <w:gridSpan w:val="2"/>
             <w:tcBorders>
-              <w:bottom w:val="single" w:color="auto" w:sz="4" w:space="0"/>
+              <w:bottom w:val="single" w:sz="4" w:space="0" w:color="auto"/>
             </w:tcBorders>
-            <w:shd w:val="clear" w:color="auto" w:fill="auto"/>
-            <w:tcMar/>
             <w:vAlign w:val="center"/>
           </w:tcPr>
           <w:p>
@@ -1377,10 +1344,8 @@
             <w:tcW w:w="2978" w:type="dxa"/>
             <w:gridSpan w:val="2"/>
             <w:tcBorders>
-              <w:bottom w:val="single" w:color="auto" w:sz="4" w:space="0"/>
+              <w:bottom w:val="single" w:sz="4" w:space="0" w:color="auto"/>
             </w:tcBorders>
-            <w:shd w:val="clear" w:color="auto" w:fill="auto"/>
-            <w:tcMar/>
             <w:vAlign w:val="center"/>
           </w:tcPr>
           <w:p>
@@ -1417,10 +1382,8 @@
           <w:tcPr>
             <w:tcW w:w="850" w:type="dxa"/>
             <w:tcBorders>
-              <w:bottom w:val="single" w:color="auto" w:sz="4" w:space="0"/>
+              <w:bottom w:val="single" w:sz="4" w:space="0" w:color="auto"/>
             </w:tcBorders>
-            <w:shd w:val="clear" w:color="auto" w:fill="auto"/>
-            <w:tcMar/>
             <w:vAlign w:val="center"/>
           </w:tcPr>
           <w:p>
@@ -1433,10 +1396,8 @@
           <w:tcPr>
             <w:tcW w:w="1276" w:type="dxa"/>
             <w:tcBorders>
-              <w:bottom w:val="single" w:color="auto" w:sz="4" w:space="0"/>
+              <w:bottom w:val="single" w:sz="4" w:space="0" w:color="auto"/>
             </w:tcBorders>
-            <w:shd w:val="clear" w:color="auto" w:fill="auto"/>
-            <w:tcMar/>
             <w:vAlign w:val="center"/>
           </w:tcPr>
           <w:p>
@@ -1493,10 +1454,8 @@
           <w:tcPr>
             <w:tcW w:w="2410" w:type="dxa"/>
             <w:tcBorders>
-              <w:bottom w:val="single" w:color="auto" w:sz="4" w:space="0"/>
+              <w:bottom w:val="single" w:sz="4" w:space="0" w:color="auto"/>
             </w:tcBorders>
-            <w:shd w:val="clear" w:color="auto" w:fill="auto"/>
-            <w:tcMar/>
             <w:vAlign w:val="center"/>
           </w:tcPr>
           <w:p>
@@ -1509,10 +1468,8 @@
           <w:tcPr>
             <w:tcW w:w="1559" w:type="dxa"/>
             <w:tcBorders>
-              <w:bottom w:val="single" w:color="auto" w:sz="4" w:space="0"/>
+              <w:bottom w:val="single" w:sz="4" w:space="0" w:color="auto"/>
             </w:tcBorders>
-            <w:shd w:val="clear" w:color="auto" w:fill="auto"/>
-            <w:tcMar/>
             <w:vAlign w:val="center"/>
           </w:tcPr>
           <w:p>
@@ -1561,10 +1518,8 @@
             <w:tcW w:w="1843" w:type="dxa"/>
             <w:gridSpan w:val="2"/>
             <w:tcBorders>
-              <w:bottom w:val="single" w:color="auto" w:sz="4" w:space="0"/>
+              <w:bottom w:val="single" w:sz="4" w:space="0" w:color="auto"/>
             </w:tcBorders>
-            <w:shd w:val="clear" w:color="auto" w:fill="auto"/>
-            <w:tcMar/>
             <w:vAlign w:val="center"/>
           </w:tcPr>
           <w:p>
@@ -1583,10 +1538,8 @@
             <w:tcW w:w="2978" w:type="dxa"/>
             <w:gridSpan w:val="2"/>
             <w:tcBorders>
-              <w:bottom w:val="single" w:color="auto" w:sz="4" w:space="0"/>
+              <w:bottom w:val="single" w:sz="4" w:space="0" w:color="auto"/>
             </w:tcBorders>
-            <w:shd w:val="clear" w:color="auto" w:fill="auto"/>
-            <w:tcMar/>
             <w:vAlign w:val="center"/>
           </w:tcPr>
           <w:p>
@@ -1636,8 +1589,8 @@
               <w:ind w:right="-165"/>
               <w:rPr>
                 <w:rFonts w:ascii="Verdana" w:hAnsi="Verdana"/>
-                <w:b w:val="1"/>
-                <w:bCs w:val="1"/>
+                <w:b/>
+                <w:bCs/>
                 <w:color w:val="FF0000"/>
                 <w:sz w:val="14"/>
                 <w:szCs w:val="14"/>
@@ -1646,8 +1599,8 @@
             <w:r>
               <w:rPr>
                 <w:rFonts w:ascii="Verdana" w:hAnsi="Verdana"/>
-                <w:b w:val="1"/>
-                <w:bCs w:val="1"/>
+                <w:b/>
+                <w:bCs/>
                 <w:color w:val="FF0000"/>
                 <w:sz w:val="14"/>
                 <w:szCs w:val="14"/>
@@ -1657,8 +1610,8 @@
             <w:r>
               <w:rPr>
                 <w:rFonts w:ascii="Verdana" w:hAnsi="Verdana"/>
-                <w:b w:val="1"/>
-                <w:bCs w:val="1"/>
+                <w:b/>
+                <w:bCs/>
                 <w:color w:val="FF0000"/>
                 <w:sz w:val="14"/>
                 <w:szCs w:val="14"/>
@@ -1668,8 +1621,8 @@
             <w:r>
               <w:rPr>
                 <w:rFonts w:ascii="Verdana" w:hAnsi="Verdana"/>
-                <w:b w:val="1"/>
-                <w:bCs w:val="1"/>
+                <w:b/>
+                <w:bCs/>
                 <w:color w:val="FF0000"/>
                 <w:sz w:val="14"/>
                 <w:szCs w:val="14"/>
@@ -1679,8 +1632,8 @@
             <w:r>
               <w:rPr>
                 <w:rFonts w:ascii="Verdana" w:hAnsi="Verdana"/>
-                <w:b w:val="1"/>
-                <w:bCs w:val="1"/>
+                <w:b/>
+                <w:bCs/>
                 <w:color w:val="FF0000"/>
                 <w:sz w:val="14"/>
                 <w:szCs w:val="14"/>
@@ -1690,8 +1643,8 @@
             <w:r>
               <w:rPr>
                 <w:rFonts w:ascii="Verdana" w:hAnsi="Verdana"/>
-                <w:b w:val="1"/>
-                <w:bCs w:val="1"/>
+                <w:b/>
+                <w:bCs/>
                 <w:color w:val="FF0000"/>
                 <w:sz w:val="14"/>
                 <w:szCs w:val="14"/>
@@ -1701,8 +1654,8 @@
             <w:r>
               <w:rPr>
                 <w:rFonts w:ascii="Verdana" w:hAnsi="Verdana"/>
-                <w:b w:val="1"/>
-                <w:bCs w:val="1"/>
+                <w:b/>
+                <w:bCs/>
                 <w:color w:val="FF0000"/>
                 <w:sz w:val="14"/>
                 <w:szCs w:val="14"/>
@@ -1712,8 +1665,8 @@
             <w:r>
               <w:rPr>
                 <w:rFonts w:ascii="Verdana" w:hAnsi="Verdana"/>
-                <w:b w:val="1"/>
-                <w:bCs w:val="1"/>
+                <w:b/>
+                <w:bCs/>
                 <w:color w:val="FF0000"/>
                 <w:sz w:val="14"/>
                 <w:szCs w:val="14"/>
@@ -1726,10 +1679,8 @@
           <w:tcPr>
             <w:tcW w:w="850" w:type="dxa"/>
             <w:tcBorders>
-              <w:bottom w:val="single" w:color="auto" w:sz="4" w:space="0"/>
+              <w:bottom w:val="single" w:sz="4" w:space="0" w:color="auto"/>
             </w:tcBorders>
-            <w:shd w:val="clear" w:color="auto" w:fill="auto"/>
-            <w:tcMar/>
             <w:vAlign w:val="center"/>
           </w:tcPr>
           <w:p>
@@ -1742,10 +1693,8 @@
           <w:tcPr>
             <w:tcW w:w="1276" w:type="dxa"/>
             <w:tcBorders>
-              <w:bottom w:val="single" w:color="auto" w:sz="4" w:space="0"/>
+              <w:bottom w:val="single" w:sz="4" w:space="0" w:color="auto"/>
             </w:tcBorders>
-            <w:shd w:val="clear" w:color="auto" w:fill="auto"/>
-            <w:tcMar/>
             <w:vAlign w:val="center"/>
           </w:tcPr>
           <w:p>
@@ -1782,10 +1731,8 @@
           <w:tcPr>
             <w:tcW w:w="2410" w:type="dxa"/>
             <w:tcBorders>
-              <w:bottom w:val="single" w:color="auto" w:sz="4" w:space="0"/>
+              <w:bottom w:val="single" w:sz="4" w:space="0" w:color="auto"/>
             </w:tcBorders>
-            <w:shd w:val="clear" w:color="auto" w:fill="auto"/>
-            <w:tcMar/>
             <w:vAlign w:val="center"/>
           </w:tcPr>
           <w:p>
@@ -1798,10 +1745,8 @@
           <w:tcPr>
             <w:tcW w:w="1559" w:type="dxa"/>
             <w:tcBorders>
-              <w:bottom w:val="single" w:color="auto" w:sz="4" w:space="0"/>
+              <w:bottom w:val="single" w:sz="4" w:space="0" w:color="auto"/>
             </w:tcBorders>
-            <w:shd w:val="clear" w:color="auto" w:fill="auto"/>
-            <w:tcMar/>
             <w:vAlign w:val="center"/>
           </w:tcPr>
           <w:p>
@@ -1830,10 +1775,8 @@
             <w:tcW w:w="1843" w:type="dxa"/>
             <w:gridSpan w:val="2"/>
             <w:tcBorders>
-              <w:bottom w:val="single" w:color="auto" w:sz="4" w:space="0"/>
+              <w:bottom w:val="single" w:sz="4" w:space="0" w:color="auto"/>
             </w:tcBorders>
-            <w:shd w:val="clear" w:color="auto" w:fill="auto"/>
-            <w:tcMar/>
             <w:vAlign w:val="center"/>
           </w:tcPr>
           <w:p>
@@ -1852,10 +1795,8 @@
             <w:tcW w:w="2978" w:type="dxa"/>
             <w:gridSpan w:val="2"/>
             <w:tcBorders>
-              <w:bottom w:val="single" w:color="auto" w:sz="4" w:space="0"/>
+              <w:bottom w:val="single" w:sz="4" w:space="0" w:color="auto"/>
             </w:tcBorders>
-            <w:shd w:val="clear" w:color="auto" w:fill="auto"/>
-            <w:tcMar/>
           </w:tcPr>
           <w:p>
             <w:pPr>
@@ -1906,8 +1847,6 @@
           <w:tcPr>
             <w:tcW w:w="2126" w:type="dxa"/>
             <w:gridSpan w:val="2"/>
-            <w:shd w:val="clear" w:color="auto" w:fill="auto"/>
-            <w:tcMar/>
           </w:tcPr>
           <w:p>
             <w:r>
@@ -1920,10 +1859,8 @@
             <w:tcW w:w="3969" w:type="dxa"/>
             <w:gridSpan w:val="2"/>
             <w:tcBorders>
-              <w:bottom w:val="single" w:color="auto" w:sz="4" w:space="0"/>
+              <w:bottom w:val="single" w:sz="4" w:space="0" w:color="auto"/>
             </w:tcBorders>
-            <w:shd w:val="clear" w:color="auto" w:fill="auto"/>
-            <w:tcMar/>
           </w:tcPr>
           <w:p>
             <w:pPr>
@@ -1985,8 +1922,6 @@
           <w:tcPr>
             <w:tcW w:w="1843" w:type="dxa"/>
             <w:gridSpan w:val="2"/>
-            <w:shd w:val="clear" w:color="auto" w:fill="auto"/>
-            <w:tcMar/>
           </w:tcPr>
           <w:p>
             <w:r>
@@ -2007,10 +1942,8 @@
             <w:tcW w:w="2978" w:type="dxa"/>
             <w:gridSpan w:val="2"/>
             <w:tcBorders>
-              <w:bottom w:val="single" w:color="auto" w:sz="4" w:space="0"/>
+              <w:bottom w:val="single" w:sz="4" w:space="0" w:color="auto"/>
             </w:tcBorders>
-            <w:shd w:val="clear" w:color="auto" w:fill="auto"/>
-            <w:tcMar/>
             <w:vAlign w:val="center"/>
           </w:tcPr>
           <w:p>
@@ -2068,9 +2001,8 @@
             <w:tcW w:w="2126" w:type="dxa"/>
             <w:gridSpan w:val="2"/>
             <w:tcBorders>
-              <w:bottom w:val="single" w:color="auto" w:sz="4" w:space="0"/>
+              <w:bottom w:val="single" w:sz="4" w:space="0" w:color="auto"/>
             </w:tcBorders>
-            <w:tcMar/>
             <w:vAlign w:val="center"/>
           </w:tcPr>
           <w:p>
@@ -2084,10 +2016,8 @@
             <w:tcW w:w="3969" w:type="dxa"/>
             <w:gridSpan w:val="2"/>
             <w:tcBorders>
-              <w:bottom w:val="single" w:color="auto" w:sz="4" w:space="0"/>
+              <w:bottom w:val="single" w:sz="4" w:space="0" w:color="auto"/>
             </w:tcBorders>
-            <w:shd w:val="clear" w:color="auto" w:fill="auto"/>
-            <w:tcMar/>
             <w:vAlign w:val="center"/>
           </w:tcPr>
           <w:p>
@@ -2144,7 +2074,6 @@
           <w:tcPr>
             <w:tcW w:w="1843" w:type="dxa"/>
             <w:gridSpan w:val="2"/>
-            <w:tcMar/>
             <w:vAlign w:val="center"/>
           </w:tcPr>
           <w:p>
@@ -2165,8 +2094,6 @@
           <w:tcPr>
             <w:tcW w:w="9073" w:type="dxa"/>
             <w:gridSpan w:val="6"/>
-            <w:shd w:val="clear" w:color="auto" w:fill="auto"/>
-            <w:tcMar/>
             <w:vAlign w:val="center"/>
           </w:tcPr>
           <w:p/>
@@ -2175,7 +2102,6 @@
           <w:tcPr>
             <w:tcW w:w="1843" w:type="dxa"/>
             <w:gridSpan w:val="2"/>
-            <w:tcMar/>
             <w:vAlign w:val="center"/>
           </w:tcPr>
           <w:p>
@@ -2370,7 +2296,7 @@
             <w:tcW w:w="10916" w:type="dxa"/>
             <w:gridSpan w:val="4"/>
             <w:tcBorders>
-              <w:bottom w:val="single" w:color="auto" w:sz="4" w:space="0"/>
+              <w:bottom w:val="single" w:sz="4" w:space="0" w:color="auto"/>
             </w:tcBorders>
             <w:shd w:val="pct20" w:color="auto" w:fill="auto"/>
             <w:vAlign w:val="center"/>
@@ -2426,8 +2352,8 @@
             <w:tcW w:w="10916" w:type="dxa"/>
             <w:gridSpan w:val="4"/>
             <w:tcBorders>
-              <w:top w:val="single" w:color="auto" w:sz="4" w:space="0"/>
-              <w:bottom w:val="single" w:color="auto" w:sz="4" w:space="0"/>
+              <w:top w:val="single" w:sz="4" w:space="0" w:color="auto"/>
+              <w:bottom w:val="single" w:sz="4" w:space="0" w:color="auto"/>
             </w:tcBorders>
             <w:shd w:val="pct20" w:color="auto" w:fill="auto"/>
             <w:vAlign w:val="center"/>
@@ -2463,7 +2389,7 @@
             <w:tcW w:w="10916" w:type="dxa"/>
             <w:gridSpan w:val="4"/>
             <w:tcBorders>
-              <w:top w:val="single" w:color="auto" w:sz="4" w:space="0"/>
+              <w:top w:val="single" w:sz="4" w:space="0" w:color="auto"/>
             </w:tcBorders>
             <w:shd w:val="pct20" w:color="auto" w:fill="auto"/>
             <w:vAlign w:val="center"/>
@@ -2598,7 +2524,7 @@
           <w:szCs w:val="24"/>
         </w:rPr>
       </w:pPr>
-      <w:bookmarkStart w:name="_Hlk37240460" w:id="0"/>
+      <w:bookmarkStart w:id="0" w:name="_Hlk37240460"/>
       <w:r>
         <w:rPr>
           <w:rFonts w:ascii="Verdana" w:hAnsi="Verdana"/>
@@ -2725,7 +2651,7 @@
           <w:tcPr>
             <w:tcW w:w="5135" w:type="dxa"/>
             <w:tcBorders>
-              <w:bottom w:val="single" w:color="auto" w:sz="4" w:space="0"/>
+              <w:bottom w:val="single" w:sz="4" w:space="0" w:color="auto"/>
             </w:tcBorders>
             <w:shd w:val="pct60" w:color="auto" w:fill="auto"/>
             <w:vAlign w:val="center"/>
@@ -2784,7 +2710,6 @@
         <w:tc>
           <w:tcPr>
             <w:tcW w:w="429" w:type="dxa"/>
-            <w:shd w:val="clear" w:color="auto" w:fill="auto"/>
           </w:tcPr>
           <w:p>
             <w:pPr>
@@ -2864,6 +2789,7 @@
                 <w:sz w:val="18"/>
                 <w:szCs w:val="18"/>
               </w:rPr>
+              <w:lastRenderedPageBreak/>
               <w:t>NAME</w:t>
             </w:r>
             <w:r>
@@ -2885,6 +2811,7 @@
           </w:tcPr>
           <w:p>
             <w:r>
+              <w:lastRenderedPageBreak/>
               <w:t>{{ inductor_name_date }}</w:t>
             </w:r>
           </w:p>
@@ -2898,8 +2825,8 @@
           <w:tcPr>
             <w:tcW w:w="5135" w:type="dxa"/>
             <w:tcBorders>
-              <w:top w:val="single" w:color="auto" w:sz="4" w:space="0"/>
-              <w:bottom w:val="single" w:color="auto" w:sz="4" w:space="0"/>
+              <w:top w:val="single" w:sz="4" w:space="0" w:color="auto"/>
+              <w:bottom w:val="single" w:sz="4" w:space="0" w:color="auto"/>
             </w:tcBorders>
             <w:shd w:val="pct60" w:color="auto" w:fill="auto"/>
             <w:vAlign w:val="center"/>
@@ -2920,6 +2847,7 @@
                 <w:sz w:val="14"/>
                 <w:szCs w:val="14"/>
               </w:rPr>
+              <w:lastRenderedPageBreak/>
               <w:t xml:space="preserve">HIGH VISIBILITY VEST </w:t>
             </w:r>
             <w:r>
@@ -2965,7 +2893,6 @@
         <w:tc>
           <w:tcPr>
             <w:tcW w:w="429" w:type="dxa"/>
-            <w:shd w:val="clear" w:color="auto" w:fill="auto"/>
             <w:vAlign w:val="center"/>
           </w:tcPr>
           <w:p>
@@ -3005,7 +2932,7 @@
             <w:vMerge/>
             <w:tcBorders>
               <w:top w:val="nil"/>
-              <w:bottom w:val="single" w:color="auto" w:sz="4" w:space="0"/>
+              <w:bottom w:val="single" w:sz="4" w:space="0" w:color="auto"/>
             </w:tcBorders>
             <w:shd w:val="pct60" w:color="auto" w:fill="auto"/>
             <w:vAlign w:val="center"/>
@@ -3045,8 +2972,8 @@
           <w:tcPr>
             <w:tcW w:w="5135" w:type="dxa"/>
             <w:tcBorders>
-              <w:top w:val="single" w:color="auto" w:sz="4" w:space="0"/>
-              <w:bottom w:val="single" w:color="auto" w:sz="4" w:space="0"/>
+              <w:top w:val="single" w:sz="4" w:space="0" w:color="auto"/>
+              <w:bottom w:val="single" w:sz="4" w:space="0" w:color="auto"/>
             </w:tcBorders>
             <w:shd w:val="pct60" w:color="auto" w:fill="auto"/>
             <w:vAlign w:val="center"/>
@@ -3145,7 +3072,6 @@
         <w:tc>
           <w:tcPr>
             <w:tcW w:w="429" w:type="dxa"/>
-            <w:shd w:val="clear" w:color="auto" w:fill="auto"/>
             <w:vAlign w:val="center"/>
           </w:tcPr>
           <w:p>
@@ -3254,8 +3180,8 @@
           <w:tcPr>
             <w:tcW w:w="5135" w:type="dxa"/>
             <w:tcBorders>
-              <w:top w:val="single" w:color="auto" w:sz="4" w:space="0"/>
-              <w:bottom w:val="single" w:color="auto" w:sz="4" w:space="0"/>
+              <w:top w:val="single" w:sz="4" w:space="0" w:color="auto"/>
+              <w:bottom w:val="single" w:sz="4" w:space="0" w:color="auto"/>
             </w:tcBorders>
             <w:shd w:val="pct60" w:color="auto" w:fill="auto"/>
             <w:vAlign w:val="center"/>
@@ -3344,7 +3270,6 @@
         <w:tc>
           <w:tcPr>
             <w:tcW w:w="429" w:type="dxa"/>
-            <w:shd w:val="clear" w:color="auto" w:fill="auto"/>
             <w:vAlign w:val="center"/>
           </w:tcPr>
           <w:p>
@@ -3384,7 +3309,7 @@
             <w:vMerge/>
             <w:tcBorders>
               <w:top w:val="nil"/>
-              <w:bottom w:val="single" w:color="auto" w:sz="4" w:space="0"/>
+              <w:bottom w:val="single" w:sz="4" w:space="0" w:color="auto"/>
             </w:tcBorders>
             <w:shd w:val="pct60" w:color="auto" w:fill="auto"/>
             <w:vAlign w:val="center"/>
@@ -3424,8 +3349,8 @@
           <w:tcPr>
             <w:tcW w:w="5135" w:type="dxa"/>
             <w:tcBorders>
-              <w:top w:val="single" w:color="auto" w:sz="4" w:space="0"/>
-              <w:bottom w:val="single" w:color="auto" w:sz="4" w:space="0"/>
+              <w:top w:val="single" w:sz="4" w:space="0" w:color="auto"/>
+              <w:bottom w:val="single" w:sz="4" w:space="0" w:color="auto"/>
             </w:tcBorders>
             <w:shd w:val="pct60" w:color="auto" w:fill="auto"/>
             <w:vAlign w:val="center"/>
@@ -3564,7 +3489,6 @@
         <w:tc>
           <w:tcPr>
             <w:tcW w:w="429" w:type="dxa"/>
-            <w:shd w:val="clear" w:color="auto" w:fill="auto"/>
             <w:vAlign w:val="center"/>
           </w:tcPr>
           <w:p>
@@ -3670,8 +3594,8 @@
           <w:tcPr>
             <w:tcW w:w="5135" w:type="dxa"/>
             <w:tcBorders>
-              <w:top w:val="single" w:color="auto" w:sz="4" w:space="0"/>
-              <w:bottom w:val="single" w:color="auto" w:sz="4" w:space="0"/>
+              <w:top w:val="single" w:sz="4" w:space="0" w:color="auto"/>
+              <w:bottom w:val="single" w:sz="4" w:space="0" w:color="auto"/>
             </w:tcBorders>
             <w:shd w:val="pct60" w:color="auto" w:fill="auto"/>
             <w:vAlign w:val="center"/>
@@ -3750,7 +3674,6 @@
         <w:tc>
           <w:tcPr>
             <w:tcW w:w="429" w:type="dxa"/>
-            <w:shd w:val="clear" w:color="auto" w:fill="auto"/>
             <w:vAlign w:val="center"/>
           </w:tcPr>
           <w:p>
@@ -3790,7 +3713,7 @@
             <w:vMerge/>
             <w:tcBorders>
               <w:top w:val="nil"/>
-              <w:bottom w:val="single" w:color="auto" w:sz="4" w:space="0"/>
+              <w:bottom w:val="single" w:sz="4" w:space="0" w:color="auto"/>
             </w:tcBorders>
             <w:shd w:val="pct60" w:color="auto" w:fill="auto"/>
             <w:vAlign w:val="center"/>
@@ -4150,12 +4073,12 @@
         <w:tblOverlap w:val="never"/>
         <w:tblW w:w="5330" w:type="pct"/>
         <w:tblBorders>
-          <w:top w:val="single" w:color="D9D9D9" w:themeColor="background1" w:themeShade="D9" w:sz="4" w:space="0"/>
-          <w:left w:val="single" w:color="D9D9D9" w:themeColor="background1" w:themeShade="D9" w:sz="4" w:space="0"/>
-          <w:bottom w:val="single" w:color="D9D9D9" w:themeColor="background1" w:themeShade="D9" w:sz="4" w:space="0"/>
-          <w:right w:val="single" w:color="D9D9D9" w:themeColor="background1" w:themeShade="D9" w:sz="4" w:space="0"/>
-          <w:insideH w:val="single" w:color="D9D9D9" w:themeColor="background1" w:themeShade="D9" w:sz="4" w:space="0"/>
-          <w:insideV w:val="single" w:color="D9D9D9" w:themeColor="background1" w:themeShade="D9" w:sz="4" w:space="0"/>
+          <w:top w:val="single" w:sz="4" w:space="0" w:color="D9D9D9" w:themeColor="background1" w:themeShade="D9"/>
+          <w:left w:val="single" w:sz="4" w:space="0" w:color="D9D9D9" w:themeColor="background1" w:themeShade="D9"/>
+          <w:bottom w:val="single" w:sz="4" w:space="0" w:color="D9D9D9" w:themeColor="background1" w:themeShade="D9"/>
+          <w:right w:val="single" w:sz="4" w:space="0" w:color="D9D9D9" w:themeColor="background1" w:themeShade="D9"/>
+          <w:insideH w:val="single" w:sz="4" w:space="0" w:color="D9D9D9" w:themeColor="background1" w:themeShade="D9"/>
+          <w:insideV w:val="single" w:sz="4" w:space="0" w:color="D9D9D9" w:themeColor="background1" w:themeShade="D9"/>
         </w:tblBorders>
         <w:tblLook w:val="04A0" w:firstRow="1" w:lastRow="0" w:firstColumn="1" w:lastColumn="0" w:noHBand="0" w:noVBand="1"/>
       </w:tblPr>
@@ -4436,7 +4359,7 @@
       </w:pPr>
     </w:p>
     <w:sectPr>
-      <w:pgSz w:w="11906" w:h="16838" w:orient="portrait"/>
+      <w:pgSz w:w="11906" w:h="16838"/>
       <w:pgMar w:top="0" w:right="424" w:bottom="142" w:left="1440" w:header="426" w:footer="125" w:gutter="0"/>
       <w:cols w:space="708"/>
       <w:docGrid w:linePitch="360"/>
@@ -4446,7 +4369,7 @@
 </file>
 
 <file path=word/endnotes.xml><?xml version="1.0" encoding="utf-8"?>
-<w:endnotes xmlns:wpc="http://schemas.microsoft.com/office/word/2010/wordprocessingCanvas" xmlns:cx="http://schemas.microsoft.com/office/drawing/2014/chartex" xmlns:cx1="http://schemas.microsoft.com/office/drawing/2015/9/8/chartex" xmlns:cx2="http://schemas.microsoft.com/office/drawing/2015/10/21/chartex" xmlns:cx3="http://schemas.microsoft.com/office/drawing/2016/5/9/chartex" xmlns:cx4="http://schemas.microsoft.com/office/drawing/2016/5/10/chartex" xmlns:cx5="http://schemas.microsoft.com/office/drawing/2016/5/11/chartex" xmlns:cx6="http://schemas.microsoft.com/office/drawing/2016/5/12/chartex" xmlns:cx7="http://schemas.microsoft.com/office/drawing/2016/5/13/chartex" xmlns:cx8="http://schemas.microsoft.com/office/drawing/2016/5/14/chartex" xmlns:mc="http://schemas.openxmlformats.org/markup-compatibility/2006" xmlns:aink="http://schemas.microsoft.com/office/drawing/2016/ink" xmlns:am3d="http://schemas.microsoft.com/office/drawing/2017/model3d" xmlns:o="urn:schemas-microsoft-com:office:office" xmlns:oel="http://schemas.microsoft.com/office/2019/extlst" xmlns:r="http://schemas.openxmlformats.org/officeDocument/2006/relationships" xmlns:m="http://schemas.openxmlformats.org/officeDocument/2006/math" xmlns:v="urn:schemas-microsoft-com:vml" xmlns:wp14="http://schemas.microsoft.com/office/word/2010/wordprocessingDrawing" xmlns:wp="http://schemas.openxmlformats.org/drawingml/2006/wordprocessingDrawing" xmlns:w10="urn:schemas-microsoft-com:office:word" xmlns:w="http://schemas.openxmlformats.org/wordprocessingml/2006/main" xmlns:w14="http://schemas.microsoft.com/office/word/2010/wordml" xmlns:w15="http://schemas.microsoft.com/office/word/2012/wordml" xmlns:w16cex="http://schemas.microsoft.com/office/word/2018/wordml/cex" xmlns:w16cid="http://schemas.microsoft.com/office/word/2016/wordml/cid" xmlns:w16="http://schemas.microsoft.com/office/word/2018/wordml" xmlns:w16sdtdh="http://schemas.microsoft.com/office/word/2020/wordml/sdtdatahash" xmlns:w16se="http://schemas.microsoft.com/office/word/2015/wordml/symex" xmlns:wpg="http://schemas.microsoft.com/office/word/2010/wordprocessingGroup" xmlns:wpi="http://schemas.microsoft.com/office/word/2010/wordprocessingInk" xmlns:wne="http://schemas.microsoft.com/office/word/2006/wordml" xmlns:wps="http://schemas.microsoft.com/office/word/2010/wordprocessingShape" mc:Ignorable="w14 w15 w16se w16cid w16 w16cex w16sdtdh wp14">
+<w:endnotes xmlns:wpc="http://schemas.microsoft.com/office/word/2010/wordprocessingCanvas" xmlns:cx="http://schemas.microsoft.com/office/drawing/2014/chartex" xmlns:cx1="http://schemas.microsoft.com/office/drawing/2015/9/8/chartex" xmlns:cx2="http://schemas.microsoft.com/office/drawing/2015/10/21/chartex" xmlns:cx3="http://schemas.microsoft.com/office/drawing/2016/5/9/chartex" xmlns:cx4="http://schemas.microsoft.com/office/drawing/2016/5/10/chartex" xmlns:cx5="http://schemas.microsoft.com/office/drawing/2016/5/11/chartex" xmlns:cx6="http://schemas.microsoft.com/office/drawing/2016/5/12/chartex" xmlns:cx7="http://schemas.microsoft.com/office/drawing/2016/5/13/chartex" xmlns:cx8="http://schemas.microsoft.com/office/drawing/2016/5/14/chartex" xmlns:mc="http://schemas.openxmlformats.org/markup-compatibility/2006" xmlns:aink="http://schemas.microsoft.com/office/drawing/2016/ink" xmlns:am3d="http://schemas.microsoft.com/office/drawing/2017/model3d" xmlns:o="urn:schemas-microsoft-com:office:office" xmlns:oel="http://schemas.microsoft.com/office/2019/extlst" xmlns:r="http://schemas.openxmlformats.org/officeDocument/2006/relationships" xmlns:m="http://schemas.openxmlformats.org/officeDocument/2006/math" xmlns:v="urn:schemas-microsoft-com:vml" xmlns:wp14="http://schemas.microsoft.com/office/word/2010/wordprocessingDrawing" xmlns:wp="http://schemas.openxmlformats.org/drawingml/2006/wordprocessingDrawing" xmlns:w10="urn:schemas-microsoft-com:office:word" xmlns:w="http://schemas.openxmlformats.org/wordprocessingml/2006/main" xmlns:w14="http://schemas.microsoft.com/office/word/2010/wordml" xmlns:w15="http://schemas.microsoft.com/office/word/2012/wordml" xmlns:w16cex="http://schemas.microsoft.com/office/word/2018/wordml/cex" xmlns:w16cid="http://schemas.microsoft.com/office/word/2016/wordml/cid" xmlns:w16="http://schemas.microsoft.com/office/word/2018/wordml" xmlns:w16du="http://schemas.microsoft.com/office/word/2023/wordml/word16du" xmlns:w16sdtdh="http://schemas.microsoft.com/office/word/2020/wordml/sdtdatahash" xmlns:w16sdtfl="http://schemas.microsoft.com/office/word/2024/wordml/sdtformatlock" xmlns:w16se="http://schemas.microsoft.com/office/word/2015/wordml/symex" xmlns:wpg="http://schemas.microsoft.com/office/word/2010/wordprocessingGroup" xmlns:wpi="http://schemas.microsoft.com/office/word/2010/wordprocessingInk" xmlns:wne="http://schemas.microsoft.com/office/word/2006/wordml" xmlns:wps="http://schemas.microsoft.com/office/word/2010/wordprocessingShape" mc:Ignorable="w14 w15 w16se w16cid w16 w16cex w16sdtdh w16sdtfl w16du wp14">
   <w:endnote w:type="separator" w:id="-1">
     <w:p>
       <w:r>
@@ -4465,7 +4388,7 @@
 </file>
 
 <file path=word/footnotes.xml><?xml version="1.0" encoding="utf-8"?>
-<w:footnotes xmlns:wpc="http://schemas.microsoft.com/office/word/2010/wordprocessingCanvas" xmlns:cx="http://schemas.microsoft.com/office/drawing/2014/chartex" xmlns:cx1="http://schemas.microsoft.com/office/drawing/2015/9/8/chartex" xmlns:cx2="http://schemas.microsoft.com/office/drawing/2015/10/21/chartex" xmlns:cx3="http://schemas.microsoft.com/office/drawing/2016/5/9/chartex" xmlns:cx4="http://schemas.microsoft.com/office/drawing/2016/5/10/chartex" xmlns:cx5="http://schemas.microsoft.com/office/drawing/2016/5/11/chartex" xmlns:cx6="http://schemas.microsoft.com/office/drawing/2016/5/12/chartex" xmlns:cx7="http://schemas.microsoft.com/office/drawing/2016/5/13/chartex" xmlns:cx8="http://schemas.microsoft.com/office/drawing/2016/5/14/chartex" xmlns:mc="http://schemas.openxmlformats.org/markup-compatibility/2006" xmlns:aink="http://schemas.microsoft.com/office/drawing/2016/ink" xmlns:am3d="http://schemas.microsoft.com/office/drawing/2017/model3d" xmlns:o="urn:schemas-microsoft-com:office:office" xmlns:oel="http://schemas.microsoft.com/office/2019/extlst" xmlns:r="http://schemas.openxmlformats.org/officeDocument/2006/relationships" xmlns:m="http://schemas.openxmlformats.org/officeDocument/2006/math" xmlns:v="urn:schemas-microsoft-com:vml" xmlns:wp14="http://schemas.microsoft.com/office/word/2010/wordprocessingDrawing" xmlns:wp="http://schemas.openxmlformats.org/drawingml/2006/wordprocessingDrawing" xmlns:w10="urn:schemas-microsoft-com:office:word" xmlns:w="http://schemas.openxmlformats.org/wordprocessingml/2006/main" xmlns:w14="http://schemas.microsoft.com/office/word/2010/wordml" xmlns:w15="http://schemas.microsoft.com/office/word/2012/wordml" xmlns:w16cex="http://schemas.microsoft.com/office/word/2018/wordml/cex" xmlns:w16cid="http://schemas.microsoft.com/office/word/2016/wordml/cid" xmlns:w16="http://schemas.microsoft.com/office/word/2018/wordml" xmlns:w16sdtdh="http://schemas.microsoft.com/office/word/2020/wordml/sdtdatahash" xmlns:w16se="http://schemas.microsoft.com/office/word/2015/wordml/symex" xmlns:wpg="http://schemas.microsoft.com/office/word/2010/wordprocessingGroup" xmlns:wpi="http://schemas.microsoft.com/office/word/2010/wordprocessingInk" xmlns:wne="http://schemas.microsoft.com/office/word/2006/wordml" xmlns:wps="http://schemas.microsoft.com/office/word/2010/wordprocessingShape" mc:Ignorable="w14 w15 w16se w16cid w16 w16cex w16sdtdh wp14">
+<w:footnotes xmlns:wpc="http://schemas.microsoft.com/office/word/2010/wordprocessingCanvas" xmlns:cx="http://schemas.microsoft.com/office/drawing/2014/chartex" xmlns:cx1="http://schemas.microsoft.com/office/drawing/2015/9/8/chartex" xmlns:cx2="http://schemas.microsoft.com/office/drawing/2015/10/21/chartex" xmlns:cx3="http://schemas.microsoft.com/office/drawing/2016/5/9/chartex" xmlns:cx4="http://schemas.microsoft.com/office/drawing/2016/5/10/chartex" xmlns:cx5="http://schemas.microsoft.com/office/drawing/2016/5/11/chartex" xmlns:cx6="http://schemas.microsoft.com/office/drawing/2016/5/12/chartex" xmlns:cx7="http://schemas.microsoft.com/office/drawing/2016/5/13/chartex" xmlns:cx8="http://schemas.microsoft.com/office/drawing/2016/5/14/chartex" xmlns:mc="http://schemas.openxmlformats.org/markup-compatibility/2006" xmlns:aink="http://schemas.microsoft.com/office/drawing/2016/ink" xmlns:am3d="http://schemas.microsoft.com/office/drawing/2017/model3d" xmlns:o="urn:schemas-microsoft-com:office:office" xmlns:oel="http://schemas.microsoft.com/office/2019/extlst" xmlns:r="http://schemas.openxmlformats.org/officeDocument/2006/relationships" xmlns:m="http://schemas.openxmlformats.org/officeDocument/2006/math" xmlns:v="urn:schemas-microsoft-com:vml" xmlns:wp14="http://schemas.microsoft.com/office/word/2010/wordprocessingDrawing" xmlns:wp="http://schemas.openxmlformats.org/drawingml/2006/wordprocessingDrawing" xmlns:w10="urn:schemas-microsoft-com:office:word" xmlns:w="http://schemas.openxmlformats.org/wordprocessingml/2006/main" xmlns:w14="http://schemas.microsoft.com/office/word/2010/wordml" xmlns:w15="http://schemas.microsoft.com/office/word/2012/wordml" xmlns:w16cex="http://schemas.microsoft.com/office/word/2018/wordml/cex" xmlns:w16cid="http://schemas.microsoft.com/office/word/2016/wordml/cid" xmlns:w16="http://schemas.microsoft.com/office/word/2018/wordml" xmlns:w16du="http://schemas.microsoft.com/office/word/2023/wordml/word16du" xmlns:w16sdtdh="http://schemas.microsoft.com/office/word/2020/wordml/sdtdatahash" xmlns:w16sdtfl="http://schemas.microsoft.com/office/word/2024/wordml/sdtformatlock" xmlns:w16se="http://schemas.microsoft.com/office/word/2015/wordml/symex" xmlns:wpg="http://schemas.microsoft.com/office/word/2010/wordprocessingGroup" xmlns:wpi="http://schemas.microsoft.com/office/word/2010/wordprocessingInk" xmlns:wne="http://schemas.microsoft.com/office/word/2006/wordml" xmlns:wps="http://schemas.microsoft.com/office/word/2010/wordprocessingShape" mc:Ignorable="w14 w15 w16se w16cid w16 w16cex w16sdtdh w16sdtfl w16du wp14">
   <w:footnote w:type="separator" w:id="-1">
     <w:p>
       <w:r>
@@ -4484,11 +4407,11 @@
 </file>
 
 <file path=word/styles.xml><?xml version="1.0" encoding="utf-8"?>
-<w:styles xmlns:mc="http://schemas.openxmlformats.org/markup-compatibility/2006" xmlns:r="http://schemas.openxmlformats.org/officeDocument/2006/relationships" xmlns:w="http://schemas.openxmlformats.org/wordprocessingml/2006/main" xmlns:w14="http://schemas.microsoft.com/office/word/2010/wordml" xmlns:w15="http://schemas.microsoft.com/office/word/2012/wordml" xmlns:w16cex="http://schemas.microsoft.com/office/word/2018/wordml/cex" xmlns:w16cid="http://schemas.microsoft.com/office/word/2016/wordml/cid" xmlns:w16="http://schemas.microsoft.com/office/word/2018/wordml" xmlns:w16sdtdh="http://schemas.microsoft.com/office/word/2020/wordml/sdtdatahash" xmlns:w16se="http://schemas.microsoft.com/office/word/2015/wordml/symex" mc:Ignorable="w14 w15 w16se w16cid w16 w16cex w16sdtdh">
+<w:styles xmlns:mc="http://schemas.openxmlformats.org/markup-compatibility/2006" xmlns:r="http://schemas.openxmlformats.org/officeDocument/2006/relationships" xmlns:w="http://schemas.openxmlformats.org/wordprocessingml/2006/main" xmlns:w14="http://schemas.microsoft.com/office/word/2010/wordml" xmlns:w15="http://schemas.microsoft.com/office/word/2012/wordml" xmlns:w16cex="http://schemas.microsoft.com/office/word/2018/wordml/cex" xmlns:w16cid="http://schemas.microsoft.com/office/word/2016/wordml/cid" xmlns:w16="http://schemas.microsoft.com/office/word/2018/wordml" xmlns:w16du="http://schemas.microsoft.com/office/word/2023/wordml/word16du" xmlns:w16sdtdh="http://schemas.microsoft.com/office/word/2020/wordml/sdtdatahash" xmlns:w16sdtfl="http://schemas.microsoft.com/office/word/2024/wordml/sdtformatlock" xmlns:w16se="http://schemas.microsoft.com/office/word/2015/wordml/symex" mc:Ignorable="w14 w15 w16se w16cid w16 w16cex w16sdtdh w16sdtfl w16du">
   <w:docDefaults>
     <w:rPrDefault>
       <w:rPr>
-        <w:rFonts w:asciiTheme="minorHAnsi" w:hAnsiTheme="minorHAnsi" w:eastAsiaTheme="minorHAnsi" w:cstheme="minorBidi"/>
+        <w:rFonts w:asciiTheme="minorHAnsi" w:eastAsiaTheme="minorHAnsi" w:hAnsiTheme="minorHAnsi" w:cstheme="minorBidi"/>
         <w:sz w:val="22"/>
         <w:szCs w:val="22"/>
         <w:lang w:val="en-GB" w:eastAsia="en-US" w:bidi="ar-SA"/>
@@ -4503,14 +4426,14 @@
   <w:latentStyles w:defLockedState="0" w:defUIPriority="99" w:defSemiHidden="0" w:defUnhideWhenUsed="0" w:defQFormat="0" w:count="376">
     <w:lsdException w:name="Normal" w:uiPriority="0" w:qFormat="1"/>
     <w:lsdException w:name="heading 1" w:uiPriority="9" w:qFormat="1"/>
-    <w:lsdException w:name="heading 2" w:uiPriority="0" w:semiHidden="1" w:unhideWhenUsed="1" w:qFormat="1"/>
-    <w:lsdException w:name="heading 3" w:uiPriority="9" w:semiHidden="1" w:unhideWhenUsed="1" w:qFormat="1"/>
-    <w:lsdException w:name="heading 4" w:uiPriority="9" w:semiHidden="1" w:unhideWhenUsed="1" w:qFormat="1"/>
-    <w:lsdException w:name="heading 5" w:uiPriority="9" w:semiHidden="1" w:unhideWhenUsed="1" w:qFormat="1"/>
-    <w:lsdException w:name="heading 6" w:uiPriority="9" w:semiHidden="1" w:unhideWhenUsed="1" w:qFormat="1"/>
-    <w:lsdException w:name="heading 7" w:uiPriority="9" w:semiHidden="1" w:unhideWhenUsed="1" w:qFormat="1"/>
-    <w:lsdException w:name="heading 8" w:uiPriority="9" w:semiHidden="1" w:unhideWhenUsed="1" w:qFormat="1"/>
-    <w:lsdException w:name="heading 9" w:uiPriority="9" w:semiHidden="1" w:unhideWhenUsed="1" w:qFormat="1"/>
+    <w:lsdException w:name="heading 2" w:semiHidden="1" w:uiPriority="0" w:unhideWhenUsed="1" w:qFormat="1"/>
+    <w:lsdException w:name="heading 3" w:semiHidden="1" w:uiPriority="9" w:unhideWhenUsed="1" w:qFormat="1"/>
+    <w:lsdException w:name="heading 4" w:semiHidden="1" w:uiPriority="9" w:unhideWhenUsed="1" w:qFormat="1"/>
+    <w:lsdException w:name="heading 5" w:semiHidden="1" w:uiPriority="9" w:unhideWhenUsed="1" w:qFormat="1"/>
+    <w:lsdException w:name="heading 6" w:semiHidden="1" w:uiPriority="9" w:unhideWhenUsed="1" w:qFormat="1"/>
+    <w:lsdException w:name="heading 7" w:semiHidden="1" w:uiPriority="9" w:unhideWhenUsed="1" w:qFormat="1"/>
+    <w:lsdException w:name="heading 8" w:semiHidden="1" w:uiPriority="9" w:unhideWhenUsed="1" w:qFormat="1"/>
+    <w:lsdException w:name="heading 9" w:semiHidden="1" w:uiPriority="9" w:unhideWhenUsed="1" w:qFormat="1"/>
     <w:lsdException w:name="index 1" w:semiHidden="1" w:unhideWhenUsed="1"/>
     <w:lsdException w:name="index 2" w:semiHidden="1" w:unhideWhenUsed="1"/>
     <w:lsdException w:name="index 3" w:semiHidden="1" w:unhideWhenUsed="1"/>
@@ -4520,22 +4443,22 @@
     <w:lsdException w:name="index 7" w:semiHidden="1" w:unhideWhenUsed="1"/>
     <w:lsdException w:name="index 8" w:semiHidden="1" w:unhideWhenUsed="1"/>
     <w:lsdException w:name="index 9" w:semiHidden="1" w:unhideWhenUsed="1"/>
-    <w:lsdException w:name="toc 1" w:uiPriority="39" w:semiHidden="1" w:unhideWhenUsed="1"/>
-    <w:lsdException w:name="toc 2" w:uiPriority="39" w:semiHidden="1" w:unhideWhenUsed="1"/>
-    <w:lsdException w:name="toc 3" w:uiPriority="39" w:semiHidden="1" w:unhideWhenUsed="1"/>
-    <w:lsdException w:name="toc 4" w:uiPriority="39" w:semiHidden="1" w:unhideWhenUsed="1"/>
-    <w:lsdException w:name="toc 5" w:uiPriority="39" w:semiHidden="1" w:unhideWhenUsed="1"/>
-    <w:lsdException w:name="toc 6" w:uiPriority="39" w:semiHidden="1" w:unhideWhenUsed="1"/>
-    <w:lsdException w:name="toc 7" w:uiPriority="39" w:semiHidden="1" w:unhideWhenUsed="1"/>
-    <w:lsdException w:name="toc 8" w:uiPriority="39" w:semiHidden="1" w:unhideWhenUsed="1"/>
-    <w:lsdException w:name="toc 9" w:uiPriority="39" w:semiHidden="1" w:unhideWhenUsed="1"/>
+    <w:lsdException w:name="toc 1" w:semiHidden="1" w:uiPriority="39" w:unhideWhenUsed="1"/>
+    <w:lsdException w:name="toc 2" w:semiHidden="1" w:uiPriority="39" w:unhideWhenUsed="1"/>
+    <w:lsdException w:name="toc 3" w:semiHidden="1" w:uiPriority="39" w:unhideWhenUsed="1"/>
+    <w:lsdException w:name="toc 4" w:semiHidden="1" w:uiPriority="39" w:unhideWhenUsed="1"/>
+    <w:lsdException w:name="toc 5" w:semiHidden="1" w:uiPriority="39" w:unhideWhenUsed="1"/>
+    <w:lsdException w:name="toc 6" w:semiHidden="1" w:uiPriority="39" w:unhideWhenUsed="1"/>
+    <w:lsdException w:name="toc 7" w:semiHidden="1" w:uiPriority="39" w:unhideWhenUsed="1"/>
+    <w:lsdException w:name="toc 8" w:semiHidden="1" w:uiPriority="39" w:unhideWhenUsed="1"/>
+    <w:lsdException w:name="toc 9" w:semiHidden="1" w:uiPriority="39" w:unhideWhenUsed="1"/>
     <w:lsdException w:name="Normal Indent" w:semiHidden="1" w:unhideWhenUsed="1"/>
     <w:lsdException w:name="footnote text" w:semiHidden="1" w:unhideWhenUsed="1"/>
     <w:lsdException w:name="annotation text" w:semiHidden="1" w:unhideWhenUsed="1"/>
     <w:lsdException w:name="header" w:semiHidden="1" w:unhideWhenUsed="1"/>
     <w:lsdException w:name="footer" w:semiHidden="1" w:unhideWhenUsed="1"/>
     <w:lsdException w:name="index heading" w:semiHidden="1" w:unhideWhenUsed="1"/>
-    <w:lsdException w:name="caption" w:uiPriority="35" w:semiHidden="1" w:unhideWhenUsed="1" w:qFormat="1"/>
+    <w:lsdException w:name="caption" w:semiHidden="1" w:uiPriority="35" w:unhideWhenUsed="1" w:qFormat="1"/>
     <w:lsdException w:name="table of figures" w:semiHidden="1" w:unhideWhenUsed="1"/>
     <w:lsdException w:name="envelope address" w:semiHidden="1" w:unhideWhenUsed="1"/>
     <w:lsdException w:name="envelope return" w:semiHidden="1" w:unhideWhenUsed="1"/>
@@ -4566,7 +4489,7 @@
     <w:lsdException w:name="Title" w:uiPriority="10" w:qFormat="1"/>
     <w:lsdException w:name="Closing" w:semiHidden="1" w:unhideWhenUsed="1"/>
     <w:lsdException w:name="Signature" w:semiHidden="1" w:unhideWhenUsed="1"/>
-    <w:lsdException w:name="Default Paragraph Font" w:uiPriority="1" w:semiHidden="1" w:unhideWhenUsed="1"/>
+    <w:lsdException w:name="Default Paragraph Font" w:semiHidden="1" w:uiPriority="1" w:unhideWhenUsed="1"/>
     <w:lsdException w:name="Body Text" w:semiHidden="1" w:unhideWhenUsed="1"/>
     <w:lsdException w:name="Body Text Indent" w:semiHidden="1" w:unhideWhenUsed="1"/>
     <w:lsdException w:name="List Continue" w:semiHidden="1" w:unhideWhenUsed="1"/>
@@ -4766,8 +4689,8 @@
     <w:lsdException w:name="Subtle Reference" w:uiPriority="31" w:qFormat="1"/>
     <w:lsdException w:name="Intense Reference" w:uiPriority="32" w:qFormat="1"/>
     <w:lsdException w:name="Book Title" w:uiPriority="33" w:qFormat="1"/>
-    <w:lsdException w:name="Bibliography" w:uiPriority="37" w:semiHidden="1" w:unhideWhenUsed="1"/>
-    <w:lsdException w:name="TOC Heading" w:uiPriority="39" w:semiHidden="1" w:unhideWhenUsed="1" w:qFormat="1"/>
+    <w:lsdException w:name="Bibliography" w:semiHidden="1" w:uiPriority="37" w:unhideWhenUsed="1"/>
+    <w:lsdException w:name="TOC Heading" w:semiHidden="1" w:uiPriority="39" w:unhideWhenUsed="1" w:qFormat="1"/>
     <w:lsdException w:name="Plain Table 1" w:uiPriority="41"/>
     <w:lsdException w:name="Plain Table 2" w:uiPriority="42"/>
     <w:lsdException w:name="Plain Table 3" w:uiPriority="43"/>
@@ -4878,7 +4801,7 @@
     <w:lsdException w:name="Unresolved Mention" w:semiHidden="1" w:unhideWhenUsed="1"/>
     <w:lsdException w:name="Smart Link" w:semiHidden="1" w:unhideWhenUsed="1"/>
   </w:latentStyles>
-  <w:style w:type="paragraph" w:styleId="Normal" w:default="1">
+  <w:style w:type="paragraph" w:default="1" w:styleId="Normal">
     <w:name w:val="Normal"/>
     <w:qFormat/>
     <w:rsid w:val="00381F17"/>
@@ -4886,7 +4809,7 @@
       <w:spacing w:after="0" w:line="240" w:lineRule="auto"/>
     </w:pPr>
     <w:rPr>
-      <w:rFonts w:ascii="Arial" w:hAnsi="Arial" w:eastAsia="Times New Roman" w:cs="Times New Roman"/>
+      <w:rFonts w:ascii="Arial" w:eastAsia="Times New Roman" w:hAnsi="Arial" w:cs="Times New Roman"/>
       <w:sz w:val="24"/>
       <w:szCs w:val="20"/>
     </w:rPr>
@@ -4914,13 +4837,13 @@
       <w:lang w:val="en-US"/>
     </w:rPr>
   </w:style>
-  <w:style w:type="character" w:styleId="DefaultParagraphFont" w:default="1">
+  <w:style w:type="character" w:default="1" w:styleId="DefaultParagraphFont">
     <w:name w:val="Default Paragraph Font"/>
     <w:uiPriority w:val="1"/>
     <w:semiHidden/>
     <w:unhideWhenUsed/>
   </w:style>
-  <w:style w:type="table" w:styleId="TableNormal" w:default="1">
+  <w:style w:type="table" w:default="1" w:styleId="TableNormal">
     <w:name w:val="Normal Table"/>
     <w:uiPriority w:val="99"/>
     <w:semiHidden/>
@@ -4935,7 +4858,7 @@
       </w:tblCellMar>
     </w:tblPr>
   </w:style>
-  <w:style w:type="numbering" w:styleId="NoList" w:default="1">
+  <w:style w:type="numbering" w:default="1" w:styleId="NoList">
     <w:name w:val="No List"/>
     <w:uiPriority w:val="99"/>
     <w:semiHidden/>
@@ -4951,12 +4874,12 @@
     </w:pPr>
     <w:tblPr>
       <w:tblBorders>
-        <w:top w:val="single" w:color="auto" w:sz="4" w:space="0"/>
-        <w:left w:val="single" w:color="auto" w:sz="4" w:space="0"/>
-        <w:bottom w:val="single" w:color="auto" w:sz="4" w:space="0"/>
-        <w:right w:val="single" w:color="auto" w:sz="4" w:space="0"/>
-        <w:insideH w:val="single" w:color="auto" w:sz="4" w:space="0"/>
-        <w:insideV w:val="single" w:color="auto" w:sz="4" w:space="0"/>
+        <w:top w:val="single" w:sz="4" w:space="0" w:color="auto"/>
+        <w:left w:val="single" w:sz="4" w:space="0" w:color="auto"/>
+        <w:bottom w:val="single" w:sz="4" w:space="0" w:color="auto"/>
+        <w:right w:val="single" w:sz="4" w:space="0" w:color="auto"/>
+        <w:insideH w:val="single" w:sz="4" w:space="0" w:color="auto"/>
+        <w:insideV w:val="single" w:sz="4" w:space="0" w:color="auto"/>
       </w:tblBorders>
     </w:tblPr>
   </w:style>
@@ -4974,12 +4897,12 @@
       </w:tabs>
     </w:pPr>
     <w:rPr>
-      <w:rFonts w:asciiTheme="minorHAnsi" w:hAnsiTheme="minorHAnsi" w:eastAsiaTheme="minorHAnsi" w:cstheme="minorBidi"/>
+      <w:rFonts w:asciiTheme="minorHAnsi" w:eastAsiaTheme="minorHAnsi" w:hAnsiTheme="minorHAnsi" w:cstheme="minorBidi"/>
       <w:sz w:val="22"/>
       <w:szCs w:val="22"/>
     </w:rPr>
   </w:style>
-  <w:style w:type="character" w:styleId="HeaderChar" w:customStyle="1">
+  <w:style w:type="character" w:customStyle="1" w:styleId="HeaderChar">
     <w:name w:val="Header Char"/>
     <w:basedOn w:val="DefaultParagraphFont"/>
     <w:link w:val="Header"/>
@@ -5000,25 +4923,25 @@
       </w:tabs>
     </w:pPr>
     <w:rPr>
-      <w:rFonts w:asciiTheme="minorHAnsi" w:hAnsiTheme="minorHAnsi" w:eastAsiaTheme="minorHAnsi" w:cstheme="minorBidi"/>
+      <w:rFonts w:asciiTheme="minorHAnsi" w:eastAsiaTheme="minorHAnsi" w:hAnsiTheme="minorHAnsi" w:cstheme="minorBidi"/>
       <w:sz w:val="22"/>
       <w:szCs w:val="22"/>
     </w:rPr>
   </w:style>
-  <w:style w:type="character" w:styleId="FooterChar" w:customStyle="1">
+  <w:style w:type="character" w:customStyle="1" w:styleId="FooterChar">
     <w:name w:val="Footer Char"/>
     <w:basedOn w:val="DefaultParagraphFont"/>
     <w:link w:val="Footer"/>
     <w:uiPriority w:val="99"/>
     <w:rsid w:val="00422A67"/>
   </w:style>
-  <w:style w:type="character" w:styleId="Heading2Char" w:customStyle="1">
+  <w:style w:type="character" w:customStyle="1" w:styleId="Heading2Char">
     <w:name w:val="Heading 2 Char"/>
     <w:basedOn w:val="DefaultParagraphFont"/>
     <w:link w:val="Heading2"/>
     <w:rsid w:val="00A47AC6"/>
     <w:rPr>
-      <w:rFonts w:ascii="Arial" w:hAnsi="Arial" w:eastAsia="Times New Roman" w:cs="Arial"/>
+      <w:rFonts w:ascii="Arial" w:eastAsia="Times New Roman" w:hAnsi="Arial" w:cs="Arial"/>
       <w:b/>
       <w:bCs/>
       <w:i/>
@@ -5042,7 +4965,7 @@
       <w:szCs w:val="16"/>
     </w:rPr>
   </w:style>
-  <w:style w:type="character" w:styleId="BalloonTextChar" w:customStyle="1">
+  <w:style w:type="character" w:customStyle="1" w:styleId="BalloonTextChar">
     <w:name w:val="Balloon Text Char"/>
     <w:basedOn w:val="DefaultParagraphFont"/>
     <w:link w:val="BalloonText"/>
@@ -5355,30 +5278,6 @@
 </file>
 
 <file path=customXml/item1.xml><?xml version="1.0" encoding="utf-8"?>
-<p:properties xmlns:p="http://schemas.microsoft.com/office/2006/metadata/properties" xmlns:xsi="http://www.w3.org/2001/XMLSchema-instance" xmlns:pc="http://schemas.microsoft.com/office/infopath/2007/PartnerControls">
-  <documentManagement>
-    <lcf76f155ced4ddcb4097134ff3c332f xmlns="cd9c8289-8385-47bd-816d-723acc924aa4">
-      <Terms xmlns="http://schemas.microsoft.com/office/infopath/2007/PartnerControls"/>
-    </lcf76f155ced4ddcb4097134ff3c332f>
-    <TaxCatchAll xmlns="1b18a214-1553-4950-8a48-fb3f8bb9f3c4" xsi:nil="true"/>
-  </documentManagement>
-</p:properties>
-</file>
-
-<file path=customXml/item2.xml><?xml version="1.0" encoding="utf-8"?>
-<?mso-contentType ?>
-<FormTemplates xmlns="http://schemas.microsoft.com/sharepoint/v3/contenttype/forms">
-  <Display>DocumentLibraryForm</Display>
-  <Edit>DocumentLibraryForm</Edit>
-  <New>DocumentLibraryForm</New>
-</FormTemplates>
-</file>
-
-<file path=customXml/item3.xml><?xml version="1.0" encoding="utf-8"?>
-<b:Sources xmlns:b="http://schemas.openxmlformats.org/officeDocument/2006/bibliography" xmlns="http://schemas.openxmlformats.org/officeDocument/2006/bibliography" SelectedStyle="\APA.XSL" StyleName="APA"/>
-</file>
-
-<file path=customXml/item4.xml><?xml version="1.0" encoding="utf-8"?>
 <ct:contentTypeSchema xmlns:ct="http://schemas.microsoft.com/office/2006/metadata/contentType" xmlns:ma="http://schemas.microsoft.com/office/2006/metadata/properties/metaAttributes" ct:_="" ma:_="" ma:contentTypeName="Document" ma:contentTypeID="0x010100A02838AB3BE4A842A0BCBE9A84C5911E" ma:contentTypeVersion="17" ma:contentTypeDescription="Create a new document." ma:contentTypeScope="" ma:versionID="baaf7c0c83cd5599c08b460cccc8e240">
   <xsd:schema xmlns:xsd="http://www.w3.org/2001/XMLSchema" xmlns:xs="http://www.w3.org/2001/XMLSchema" xmlns:p="http://schemas.microsoft.com/office/2006/metadata/properties" xmlns:ns2="cd9c8289-8385-47bd-816d-723acc924aa4" xmlns:ns3="1b18a214-1553-4950-8a48-fb3f8bb9f3c4" targetNamespace="http://schemas.microsoft.com/office/2006/metadata/properties" ma:root="true" ma:fieldsID="f0087cdf62aa5ea31a642219530a50a1" ns2:_="" ns3:_="">
     <xsd:import namespace="cd9c8289-8385-47bd-816d-723acc924aa4"/>
@@ -5621,18 +5520,58 @@
 </ct:contentTypeSchema>
 </file>
 
+<file path=customXml/item2.xml><?xml version="1.0" encoding="utf-8"?>
+<b:Sources xmlns:b="http://schemas.openxmlformats.org/officeDocument/2006/bibliography" xmlns="http://schemas.openxmlformats.org/officeDocument/2006/bibliography" SelectedStyle="\APA.XSL" StyleName="APA"/>
+</file>
+
+<file path=customXml/item3.xml><?xml version="1.0" encoding="utf-8"?>
+<?mso-contentType ?>
+<FormTemplates xmlns="http://schemas.microsoft.com/sharepoint/v3/contenttype/forms">
+  <Display>DocumentLibraryForm</Display>
+  <Edit>DocumentLibraryForm</Edit>
+  <New>DocumentLibraryForm</New>
+</FormTemplates>
+</file>
+
+<file path=customXml/item4.xml><?xml version="1.0" encoding="utf-8"?>
+<p:properties xmlns:p="http://schemas.microsoft.com/office/2006/metadata/properties" xmlns:xsi="http://www.w3.org/2001/XMLSchema-instance" xmlns:pc="http://schemas.microsoft.com/office/infopath/2007/PartnerControls">
+  <documentManagement>
+    <lcf76f155ced4ddcb4097134ff3c332f xmlns="cd9c8289-8385-47bd-816d-723acc924aa4">
+      <Terms xmlns="http://schemas.microsoft.com/office/infopath/2007/PartnerControls"/>
+    </lcf76f155ced4ddcb4097134ff3c332f>
+    <TaxCatchAll xmlns="1b18a214-1553-4950-8a48-fb3f8bb9f3c4" xsi:nil="true"/>
+  </documentManagement>
+</p:properties>
+</file>
+
 <file path=customXml/itemProps1.xml><?xml version="1.0" encoding="utf-8"?>
-<ds:datastoreItem xmlns:ds="http://schemas.openxmlformats.org/officeDocument/2006/customXml" ds:itemID="{E3380A68-8167-441B-958C-2FE0EC7F9ABD}">
+<ds:datastoreItem xmlns:ds="http://schemas.openxmlformats.org/officeDocument/2006/customXml" ds:itemID="{A151DAEF-001E-412E-9383-DFC180257E6A}">
   <ds:schemaRefs>
+    <ds:schemaRef ds:uri="http://schemas.microsoft.com/office/2006/metadata/contentType"/>
+    <ds:schemaRef ds:uri="http://schemas.microsoft.com/office/2006/metadata/properties/metaAttributes"/>
+    <ds:schemaRef ds:uri="http://www.w3.org/2001/XMLSchema"/>
     <ds:schemaRef ds:uri="http://schemas.microsoft.com/office/2006/metadata/properties"/>
+    <ds:schemaRef ds:uri="cd9c8289-8385-47bd-816d-723acc924aa4"/>
+    <ds:schemaRef ds:uri="1b18a214-1553-4950-8a48-fb3f8bb9f3c4"/>
+    <ds:schemaRef ds:uri="http://schemas.microsoft.com/office/2006/documentManagement/types"/>
     <ds:schemaRef ds:uri="http://schemas.microsoft.com/office/infopath/2007/PartnerControls"/>
-    <ds:schemaRef ds:uri="034b62be-99af-4aa9-be70-5441de86440e"/>
-    <ds:schemaRef ds:uri="113b71e1-c06e-42d5-af0d-4627d6a7fe54"/>
+    <ds:schemaRef ds:uri="http://schemas.openxmlformats.org/package/2006/metadata/core-properties"/>
+    <ds:schemaRef ds:uri="http://purl.org/dc/elements/1.1/"/>
+    <ds:schemaRef ds:uri="http://purl.org/dc/terms/"/>
+    <ds:schemaRef ds:uri="http://schemas.microsoft.com/internal/obd"/>
   </ds:schemaRefs>
 </ds:datastoreItem>
 </file>
 
 <file path=customXml/itemProps2.xml><?xml version="1.0" encoding="utf-8"?>
+<ds:datastoreItem xmlns:ds="http://schemas.openxmlformats.org/officeDocument/2006/customXml" ds:itemID="{CD7CCCAE-0E34-474E-8AD7-19F43438B853}">
+  <ds:schemaRefs>
+    <ds:schemaRef ds:uri="http://schemas.openxmlformats.org/officeDocument/2006/bibliography"/>
+  </ds:schemaRefs>
+</ds:datastoreItem>
+</file>
+
+<file path=customXml/itemProps3.xml><?xml version="1.0" encoding="utf-8"?>
 <ds:datastoreItem xmlns:ds="http://schemas.openxmlformats.org/officeDocument/2006/customXml" ds:itemID="{D31195DB-72EB-40C5-B12E-E9054DF3A883}">
   <ds:schemaRefs>
     <ds:schemaRef ds:uri="http://schemas.microsoft.com/sharepoint/v3/contenttype/forms"/>
@@ -5640,14 +5579,13 @@
 </ds:datastoreItem>
 </file>
 
-<file path=customXml/itemProps3.xml><?xml version="1.0" encoding="utf-8"?>
-<ds:datastoreItem xmlns:ds="http://schemas.openxmlformats.org/officeDocument/2006/customXml" ds:itemID="{CD7CCCAE-0E34-474E-8AD7-19F43438B853}">
+<file path=customXml/itemProps4.xml><?xml version="1.0" encoding="utf-8"?>
+<ds:datastoreItem xmlns:ds="http://schemas.openxmlformats.org/officeDocument/2006/customXml" ds:itemID="{E3380A68-8167-441B-958C-2FE0EC7F9ABD}">
   <ds:schemaRefs>
-    <ds:schemaRef ds:uri="http://schemas.openxmlformats.org/officeDocument/2006/bibliography"/>
+    <ds:schemaRef ds:uri="http://schemas.microsoft.com/office/2006/metadata/properties"/>
+    <ds:schemaRef ds:uri="http://schemas.microsoft.com/office/infopath/2007/PartnerControls"/>
+    <ds:schemaRef ds:uri="cd9c8289-8385-47bd-816d-723acc924aa4"/>
+    <ds:schemaRef ds:uri="1b18a214-1553-4950-8a48-fb3f8bb9f3c4"/>
   </ds:schemaRefs>
 </ds:datastoreItem>
-</file>
-
-<file path=customXml/itemProps4.xml><?xml version="1.0" encoding="utf-8"?>
-<ds:datastoreItem xmlns:ds="http://schemas.openxmlformats.org/officeDocument/2006/customXml" ds:itemID="{A151DAEF-001E-412E-9383-DFC180257E6A}"/>
 </file>
</xml_diff>